<commit_message>
Set first version delivery date to September 21
</commit_message>
<xml_diff>
--- a/docs/Product_Sheet_Florales_PDV_ERP.docx
+++ b/docs/Product_Sheet_Florales_PDV_ERP.docx
@@ -503,6 +503,61 @@
                 <w:sz w:val="21"/>
               </w:rPr>
               <w:t>Relatórios financeiros por moeda e método de pagamento</w:t>
+            </w:r>
+          </w:p>
+        </w:tc>
+      </w:tr>
+      <w:tr>
+        <w:trPr>
+          <w:cantSplit/>
+        </w:trPr>
+        <w:tc>
+          <w:tcPr>
+            <w:tcW w:type="dxa" w:w="2232"/>
+            <w:vAlign w:val="center"/>
+            <w:tcMar>
+              <w:top w:w="110" w:type="dxa"/>
+              <w:start w:w="140" w:type="dxa"/>
+              <w:bottom w:w="110" w:type="dxa"/>
+              <w:end w:w="140" w:type="dxa"/>
+            </w:tcMar>
+          </w:tcPr>
+          <w:p>
+            <w:pPr>
+              <w:spacing w:after="0"/>
+              <w:jc w:val="left"/>
+            </w:pPr>
+            <w:r>
+              <w:rPr>
+                <w:rFonts w:ascii="Arial" w:hAnsi="Arial"/>
+                <w:sz w:val="21"/>
+              </w:rPr>
+              <w:t>Previsão da primeira versão</w:t>
+            </w:r>
+          </w:p>
+        </w:tc>
+        <w:tc>
+          <w:tcPr>
+            <w:tcW w:type="dxa" w:w="7848"/>
+            <w:vAlign w:val="center"/>
+            <w:tcMar>
+              <w:top w:w="110" w:type="dxa"/>
+              <w:start w:w="140" w:type="dxa"/>
+              <w:bottom w:w="110" w:type="dxa"/>
+              <w:end w:w="140" w:type="dxa"/>
+            </w:tcMar>
+          </w:tcPr>
+          <w:p>
+            <w:pPr>
+              <w:spacing w:after="0"/>
+              <w:jc w:val="left"/>
+            </w:pPr>
+            <w:r>
+              <w:rPr>
+                <w:rFonts w:ascii="Arial" w:hAnsi="Arial"/>
+                <w:sz w:val="21"/>
+              </w:rPr>
+              <w:t>21 de setembro de 2026</w:t>
             </w:r>
           </w:p>
         </w:tc>
@@ -4235,6 +4290,62 @@
                 <w:rFonts w:ascii="Arial" w:hAnsi="Arial"/>
                 <w:sz w:val="21"/>
               </w:rPr>
+              <w:t>Primeira versão</w:t>
+            </w:r>
+          </w:p>
+        </w:tc>
+        <w:tc>
+          <w:tcPr>
+            <w:tcW w:type="dxa" w:w="5083"/>
+            <w:vAlign w:val="center"/>
+            <w:tcMar>
+              <w:top w:w="110" w:type="dxa"/>
+              <w:start w:w="140" w:type="dxa"/>
+              <w:bottom w:w="110" w:type="dxa"/>
+              <w:end w:w="140" w:type="dxa"/>
+            </w:tcMar>
+          </w:tcPr>
+          <w:p>
+            <w:pPr>
+              <w:spacing w:after="0"/>
+              <w:jc w:val="left"/>
+            </w:pPr>
+            <w:r>
+              <w:rPr>
+                <w:rFonts w:ascii="Arial" w:hAnsi="Arial"/>
+                <w:sz w:val="21"/>
+              </w:rPr>
+              <w:t>Entrega prevista para 21 de setembro de 2026.</w:t>
+            </w:r>
+          </w:p>
+        </w:tc>
+      </w:tr>
+      <w:tr>
+        <w:trPr>
+          <w:cantSplit/>
+        </w:trPr>
+        <w:tc>
+          <w:tcPr>
+            <w:tcW w:type="dxa" w:w="5083"/>
+            <w:vAlign w:val="center"/>
+            <w:tcMar>
+              <w:top w:w="110" w:type="dxa"/>
+              <w:start w:w="140" w:type="dxa"/>
+              <w:bottom w:w="110" w:type="dxa"/>
+              <w:end w:w="140" w:type="dxa"/>
+            </w:tcMar>
+            <w:shd w:fill="F6F2F7"/>
+          </w:tcPr>
+          <w:p>
+            <w:pPr>
+              <w:spacing w:after="0"/>
+              <w:jc w:val="left"/>
+            </w:pPr>
+            <w:r>
+              <w:rPr>
+                <w:rFonts w:ascii="Arial" w:hAnsi="Arial"/>
+                <w:sz w:val="21"/>
+              </w:rPr>
               <w:t>Código-fonte</w:t>
             </w:r>
           </w:p>
@@ -4249,6 +4360,7 @@
               <w:bottom w:w="110" w:type="dxa"/>
               <w:end w:w="140" w:type="dxa"/>
             </w:tcMar>
+            <w:shd w:fill="F6F2F7"/>
           </w:tcPr>
           <w:p>
             <w:pPr>
@@ -4279,7 +4391,6 @@
               <w:bottom w:w="110" w:type="dxa"/>
               <w:end w:w="140" w:type="dxa"/>
             </w:tcMar>
-            <w:shd w:fill="F6F2F7"/>
           </w:tcPr>
           <w:p>
             <w:pPr>
@@ -4305,7 +4416,6 @@
               <w:bottom w:w="110" w:type="dxa"/>
               <w:end w:w="140" w:type="dxa"/>
             </w:tcMar>
-            <w:shd w:fill="F6F2F7"/>
           </w:tcPr>
           <w:p>
             <w:pPr>
@@ -4336,6 +4446,7 @@
               <w:bottom w:w="110" w:type="dxa"/>
               <w:end w:w="140" w:type="dxa"/>
             </w:tcMar>
+            <w:shd w:fill="F6F2F7"/>
           </w:tcPr>
           <w:p>
             <w:pPr>
@@ -4361,6 +4472,7 @@
               <w:bottom w:w="110" w:type="dxa"/>
               <w:end w:w="140" w:type="dxa"/>
             </w:tcMar>
+            <w:shd w:fill="F6F2F7"/>
           </w:tcPr>
           <w:p>
             <w:pPr>
@@ -4391,7 +4503,6 @@
               <w:bottom w:w="110" w:type="dxa"/>
               <w:end w:w="140" w:type="dxa"/>
             </w:tcMar>
-            <w:shd w:fill="F6F2F7"/>
           </w:tcPr>
           <w:p>
             <w:pPr>
@@ -4417,7 +4528,6 @@
               <w:bottom w:w="110" w:type="dxa"/>
               <w:end w:w="140" w:type="dxa"/>
             </w:tcMar>
-            <w:shd w:fill="F6F2F7"/>
           </w:tcPr>
           <w:p>
             <w:pPr>
@@ -4448,6 +4558,7 @@
               <w:bottom w:w="110" w:type="dxa"/>
               <w:end w:w="140" w:type="dxa"/>
             </w:tcMar>
+            <w:shd w:fill="F6F2F7"/>
           </w:tcPr>
           <w:p>
             <w:pPr>
@@ -4473,6 +4584,7 @@
               <w:bottom w:w="110" w:type="dxa"/>
               <w:end w:w="140" w:type="dxa"/>
             </w:tcMar>
+            <w:shd w:fill="F6F2F7"/>
           </w:tcPr>
           <w:p>
             <w:pPr>
@@ -4503,7 +4615,6 @@
               <w:bottom w:w="110" w:type="dxa"/>
               <w:end w:w="140" w:type="dxa"/>
             </w:tcMar>
-            <w:shd w:fill="F6F2F7"/>
           </w:tcPr>
           <w:p>
             <w:pPr>
@@ -4529,7 +4640,6 @@
               <w:bottom w:w="110" w:type="dxa"/>
               <w:end w:w="140" w:type="dxa"/>
             </w:tcMar>
-            <w:shd w:fill="F6F2F7"/>
           </w:tcPr>
           <w:p>
             <w:pPr>
@@ -4560,6 +4670,7 @@
               <w:bottom w:w="110" w:type="dxa"/>
               <w:end w:w="140" w:type="dxa"/>
             </w:tcMar>
+            <w:shd w:fill="F6F2F7"/>
           </w:tcPr>
           <w:p>
             <w:pPr>
@@ -4585,6 +4696,7 @@
               <w:bottom w:w="110" w:type="dxa"/>
               <w:end w:w="140" w:type="dxa"/>
             </w:tcMar>
+            <w:shd w:fill="F6F2F7"/>
           </w:tcPr>
           <w:p>
             <w:pPr>
@@ -5000,7 +5112,7 @@
                 <w:rFonts w:ascii="Arial" w:hAnsi="Arial"/>
                 <w:sz w:val="21"/>
               </w:rPr>
-              <w:t>Emissão inicial do Product Sheet e consolidação do requisito de relatórios por moeda e pagamento.</w:t>
+              <w:t>Emissão do Product Sheet com previsão da primeira versão para 21/09/2026 e consolidação dos relatórios por moeda e pagamento.</w:t>
             </w:r>
           </w:p>
         </w:tc>

</xml_diff>